<commit_message>
docs: state the one optional dependency where none was claimed
The final document, AGENTS.md and the conventions said the project had no
external Go dependencies. That stopped being true for the window build, so
the claim now names webview_go, the gui tag and ADR 0006. PDF and DOCX are
regenerated from the same source; still 20 pages.
</commit_message>
<xml_diff>
--- a/docs/entregas/final/Credenciales_seguras.docx
+++ b/docs/entregas/final/Credenciales_seguras.docx
@@ -11017,7 +11017,7 @@
           <w:i w:val="0"/>
           <w:sz w:val="24"/>
         </w:rPr>
-        <w:t xml:space="preserve">Un único binario en Go, sin dependencias externas, que sirve su propio frontend embebido con </w:t>
+        <w:t xml:space="preserve">Un único binario en Go que sirve su propio frontend embebido con </w:t>
       </w:r>
       <w:r>
         <w:rPr>
@@ -11035,7 +11035,43 @@
           <w:i w:val="0"/>
           <w:sz w:val="24"/>
         </w:rPr>
-        <w:t>. El frontend es HTML, CSS y JavaScript sin paso de compilación.</w:t>
+        <w:t xml:space="preserve">. El frontend es HTML, CSS y JavaScript sin paso de compilación. El motor de autómatas no usa ninguna biblioteca externa: la única dependencia del proyecto es </w:t>
+      </w:r>
+      <w:r>
+        <w:rPr>
+          <w:rFonts w:ascii="Courier New" w:hAnsi="Courier New" w:eastAsia="Courier New"/>
+          <w:b w:val="0"/>
+          <w:i w:val="0"/>
+          <w:sz w:val="22"/>
+        </w:rPr>
+        <w:t>webview</w:t>
+      </w:r>
+      <w:r>
+        <w:rPr>
+          <w:rFonts w:ascii="Times New Roman" w:hAnsi="Times New Roman"/>
+          <w:b w:val="0"/>
+          <w:i w:val="0"/>
+          <w:sz w:val="24"/>
+        </w:rPr>
+        <w:t xml:space="preserve">, opcional, aislada detrás de la etiqueta de compilación </w:t>
+      </w:r>
+      <w:r>
+        <w:rPr>
+          <w:rFonts w:ascii="Courier New" w:hAnsi="Courier New" w:eastAsia="Courier New"/>
+          <w:b w:val="0"/>
+          <w:i w:val="0"/>
+          <w:sz w:val="22"/>
+        </w:rPr>
+        <w:t>gui</w:t>
+      </w:r>
+      <w:r>
+        <w:rPr>
+          <w:rFonts w:ascii="Times New Roman" w:hAnsi="Times New Roman"/>
+          <w:b w:val="0"/>
+          <w:i w:val="0"/>
+          <w:sz w:val="24"/>
+        </w:rPr>
+        <w:t>, y sólo existe para abrir la ventana propia del escritorio (ADR 0006).</w:t>
       </w:r>
     </w:p>
     <w:tbl>

</xml_diff>

<commit_message>
docs(final): describe live validation and the trace jump
The screens table now says the report recalculates while typing and that
every rule with an automaton offers its trace; the paragraph after figure 3
explains the jump to the explorer. PDF and DOCX regenerated, still 20 pages.
</commit_message>
<xml_diff>
--- a/docs/entregas/final/Credenciales_seguras.docx
+++ b/docs/entregas/final/Credenciales_seguras.docx
@@ -11579,7 +11579,7 @@
                 <w:i w:val="0"/>
                 <w:sz w:val="20"/>
               </w:rPr>
-              <w:t>reporte por regla de un correo, una contraseña o un par completo, con nivel y entropía</w:t>
+              <w:t>reporte por regla de un correo, una contraseña o un par completo, con nivel y entropía; se recalcula al escribir y cada regla ofrece el recorrido de la cadena</w:t>
             </w:r>
           </w:p>
         </w:tc>
@@ -11835,6 +11835,22 @@
           <w:sz w:val="24"/>
         </w:rPr>
         <w:t>Figura 3. Validar en modo par. El correo pasa sus siete reglas y queda en verde; la contraseña contiene una palabra prohibida, P8 la marca en rojo con el mensaje que nombra el motivo, y el nivel baja a Baja. El par es inválido porque basta que falle una de las dos mitades.</w:t>
+      </w:r>
+    </w:p>
+    <w:p>
+      <w:pPr>
+        <w:keepNext w:val="0"/>
+        <w:spacing w:after="120" w:before="0" w:line="360" w:lineRule="auto"/>
+        <w:jc w:val="both"/>
+      </w:pPr>
+      <w:r>
+        <w:rPr>
+          <w:rFonts w:ascii="Times New Roman" w:hAnsi="Times New Roman"/>
+          <w:b w:val="0"/>
+          <w:i w:val="0"/>
+          <w:sz w:val="24"/>
+        </w:rPr>
+        <w:t>El reporte se recalcula mientras se escribe, sin apretar el botón, y cada regla con autómata ofrece su recorrido: la misma cadena simulada sobre el AFD mínimo, en el Explorador, con la posición donde se corta. Es el puente entre el veredicto por regla y la construcción de la sección 6.</w:t>
       </w:r>
     </w:p>
     <w:p>

</xml_diff>